<commit_message>
added some page breaks on the documents
</commit_message>
<xml_diff>
--- a/CodeLit - Docs v2.docx
+++ b/CodeLit - Docs v2.docx
@@ -1,6 +1,6 @@
 
 <file path=word/document.xml><?xml version="1.0" encoding="utf-8"?>
-<w:document xmlns:wpc="http://schemas.microsoft.com/office/word/2010/wordprocessingCanvas" xmlns:cx="http://schemas.microsoft.com/office/drawing/2014/chartex" xmlns:cx1="http://schemas.microsoft.com/office/drawing/2015/9/8/chartex" xmlns:cx2="http://schemas.microsoft.com/office/drawing/2015/10/21/chartex" xmlns:cx3="http://schemas.microsoft.com/office/drawing/2016/5/9/chartex" xmlns:cx4="http://schemas.microsoft.com/office/drawing/2016/5/10/chartex" xmlns:cx5="http://schemas.microsoft.com/office/drawing/2016/5/11/chartex" xmlns:cx6="http://schemas.microsoft.com/office/drawing/2016/5/12/chartex" xmlns:cx7="http://schemas.microsoft.com/office/drawing/2016/5/13/chartex" xmlns:cx8="http://schemas.microsoft.com/office/drawing/2016/5/14/chartex" xmlns:mc="http://schemas.openxmlformats.org/markup-compatibility/2006" xmlns:aink="http://schemas.microsoft.com/office/drawing/2016/ink" xmlns:am3d="http://schemas.microsoft.com/office/drawing/2017/model3d" xmlns:o="urn:schemas-microsoft-com:office:office" xmlns:oel="http://schemas.microsoft.com/office/2019/extlst" xmlns:r="http://schemas.openxmlformats.org/officeDocument/2006/relationships" xmlns:m="http://schemas.openxmlformats.org/officeDocument/2006/math" xmlns:v="urn:schemas-microsoft-com:vml" xmlns:wp14="http://schemas.microsoft.com/office/word/2010/wordprocessingDrawing" xmlns:wp="http://schemas.openxmlformats.org/drawingml/2006/wordprocessingDrawing" xmlns:w10="urn:schemas-microsoft-com:office:word" xmlns:w="http://schemas.openxmlformats.org/wordprocessingml/2006/main" xmlns:w14="http://schemas.microsoft.com/office/word/2010/wordml" xmlns:w15="http://schemas.microsoft.com/office/word/2012/wordml" xmlns:w16cex="http://schemas.microsoft.com/office/word/2018/wordml/cex" xmlns:w16cid="http://schemas.microsoft.com/office/word/2016/wordml/cid" xmlns:w16="http://schemas.microsoft.com/office/word/2018/wordml" xmlns:w16du="http://schemas.microsoft.com/office/word/2023/wordml/word16du" xmlns:w16sdtdh="http://schemas.microsoft.com/office/word/2020/wordml/sdtdatahash" xmlns:w16sdtfl="http://schemas.microsoft.com/office/word/2024/wordml/sdtformatlock" xmlns:w16se="http://schemas.microsoft.com/office/word/2015/wordml/symex" xmlns:wpg="http://schemas.microsoft.com/office/word/2010/wordprocessingGroup" xmlns:wpi="http://schemas.microsoft.com/office/word/2010/wordprocessingInk" xmlns:wne="http://schemas.microsoft.com/office/word/2006/wordml" xmlns:wps="http://schemas.microsoft.com/office/word/2010/wordprocessingShape" mc:Ignorable="w14 w15 w16se w16cid w16 w16cex w16sdtdh w16sdtfl w16du wp14">
+<w:document xmlns:wpc="http://schemas.microsoft.com/office/word/2010/wordprocessingCanvas" xmlns:cx="http://schemas.microsoft.com/office/drawing/2014/chartex" xmlns:cx1="http://schemas.microsoft.com/office/drawing/2015/9/8/chartex" xmlns:cx2="http://schemas.microsoft.com/office/drawing/2015/10/21/chartex" xmlns:cx3="http://schemas.microsoft.com/office/drawing/2016/5/9/chartex" xmlns:cx4="http://schemas.microsoft.com/office/drawing/2016/5/10/chartex" xmlns:cx5="http://schemas.microsoft.com/office/drawing/2016/5/11/chartex" xmlns:cx6="http://schemas.microsoft.com/office/drawing/2016/5/12/chartex" xmlns:cx7="http://schemas.microsoft.com/office/drawing/2016/5/13/chartex" xmlns:cx8="http://schemas.microsoft.com/office/drawing/2016/5/14/chartex" xmlns:mc="http://schemas.openxmlformats.org/markup-compatibility/2006" xmlns:aink="http://schemas.microsoft.com/office/drawing/2016/ink" xmlns:am3d="http://schemas.microsoft.com/office/drawing/2017/model3d" xmlns:o="urn:schemas-microsoft-com:office:office" xmlns:r="http://schemas.openxmlformats.org/officeDocument/2006/relationships" xmlns:m="http://schemas.openxmlformats.org/officeDocument/2006/math" xmlns:v="urn:schemas-microsoft-com:vml" xmlns:wp14="http://schemas.microsoft.com/office/word/2010/wordprocessingDrawing" xmlns:wp="http://schemas.openxmlformats.org/drawingml/2006/wordprocessingDrawing" xmlns:w10="urn:schemas-microsoft-com:office:word" xmlns:w="http://schemas.openxmlformats.org/wordprocessingml/2006/main" xmlns:w14="http://schemas.microsoft.com/office/word/2010/wordml" xmlns:w15="http://schemas.microsoft.com/office/word/2012/wordml" xmlns:w16cid="http://schemas.microsoft.com/office/word/2016/wordml/cid" xmlns:w16se="http://schemas.microsoft.com/office/word/2015/wordml/symex" xmlns:wpg="http://schemas.microsoft.com/office/word/2010/wordprocessingGroup" xmlns:wpi="http://schemas.microsoft.com/office/word/2010/wordprocessingInk" xmlns:wne="http://schemas.microsoft.com/office/word/2006/wordml" xmlns:wps="http://schemas.microsoft.com/office/word/2010/wordprocessingShape" mc:Ignorable="w14 w15 w16se w16cid wp14">
   <w:body>
     <w:p>
       <w:r>
@@ -43,7 +43,10 @@
       </w:r>
       <w:proofErr w:type="spellEnd"/>
       <w:r>
-        <w:t xml:space="preserve"> is a Windows desktop and web application that combines secure exam lockdown and automated programming assessment for Philippine computing education. Teachers create and manage examinations through a cloud web-based platform, while students join using an exam code through the desktop application. Exam data, user authentication, synchronization, and assessment records are managed through the cloud, enabling centralized administration and access across participating devices.</w:t>
+        <w:t xml:space="preserve"> is a Windows desktop and web application that combines secure exam lockdown and automated programming assessment for Philippine computing education. Teachers create and manage examinations through a cloud web-based platform, while students join using an e</w:t>
+      </w:r>
+      <w:r>
+        <w:t>xam code through the desktop application. Exam data, user authentication, synchronization, and assessment records are managed through the cloud, enabling centralized administration and access across participating devices.</w:t>
       </w:r>
       <w:r>
         <w:br/>
@@ -51,7 +54,10 @@
     </w:p>
     <w:p>
       <w:r>
-        <w:t xml:space="preserve">The platform features a built-in automated assessment engine that compiles and evaluates programming submissions directly on each student machine. By performing code compilation and output verification locally, </w:t>
+        <w:t xml:space="preserve">The platform features a built-in </w:t>
+      </w:r>
+      <w:r>
+        <w:t xml:space="preserve">automated assessment engine that compiles and evaluates programming submissions directly on each student machine. By performing code compilation and output verification locally, </w:t>
       </w:r>
       <w:proofErr w:type="spellStart"/>
       <w:r>
@@ -59,7 +65,10 @@
       </w:r>
       <w:proofErr w:type="spellEnd"/>
       <w:r>
-        <w:t xml:space="preserve"> delivers fast assessment results without network latency or bandwidth overhead while reducing server-side processing requirements. This approach allows programming evaluations to remain responsive even in environments with limited internet bandwidth.</w:t>
+        <w:t xml:space="preserve"> delivers fast assessment results without network latency or bandwidth </w:t>
+      </w:r>
+      <w:r>
+        <w:t>overhead while reducing server-side processing requirements. This approach allows programming evaluations to remain responsive even in environments with limited internet bandwidth.</w:t>
       </w:r>
       <w:r>
         <w:br/>
@@ -75,7 +84,13 @@
       </w:r>
       <w:proofErr w:type="spellEnd"/>
       <w:r>
-        <w:t xml:space="preserve"> provides system-wide exam lockdown capabilities that restrict access to unauthorized applications, system shortcuts, and external resources during examinations. By combining secure exam delivery, automated programming evaluation, real-time monitoring, and centralized exam management in a single platform, </w:t>
+        <w:t xml:space="preserve"> provides system-wide exa</w:t>
+      </w:r>
+      <w:r>
+        <w:t>m lockdown capabilities that restrict access to unauthorized applications, system shortcuts, and external resources during examinations. By combining secure exam delivery, automated programming evaluation, real-time monitoring, and centralized exam managem</w:t>
+      </w:r>
+      <w:r>
+        <w:t xml:space="preserve">ent in a single platform, </w:t>
       </w:r>
       <w:proofErr w:type="spellStart"/>
       <w:r>
@@ -100,7 +115,19 @@
       </w:r>
       <w:r>
         <w:br/>
-        <w:t>Most existing programming assessment platforms in Philippine computing education rely on server-side compilation, where a student's code is transmitted over the internet to a remote server, compiled, executed against test cases, and the result sent back to the student's device. This round-trip process introduces delays directly tied to network conditions and server load, since every submission must travel to and from the cloud before a result can be returned. During high-stakes testing periods such as scheduled programming examinations, this dependency becomes particularly problematic: a large number of students submit code within the same short window, causing simultaneous requests to queue on the server and significantly increasing compilation and feedback turnaround time. In a live exam setting where time is limited and pressure is already high, these delays can directly affect a student's ability to test, debug, and finalize their submission before time runs out.</w:t>
+        <w:t>Most existing programming assessment platforms in Phili</w:t>
+      </w:r>
+      <w:r>
+        <w:t>ppine computing education rely on server-side compilation, where a student's code is transmitted over the internet to a remote server, compiled, executed against test cases, and the result sent back to the student's device. This round-trip process introduc</w:t>
+      </w:r>
+      <w:r>
+        <w:t xml:space="preserve">es delays directly tied to network conditions and server load, since every submission must travel to and from the cloud before a result can be returned. During high-stakes testing periods such as scheduled programming examinations, this dependency becomes </w:t>
+      </w:r>
+      <w:r>
+        <w:t xml:space="preserve">particularly problematic: a large number of students submit code within the same short window, causing simultaneous requests to queue on the server and significantly increasing compilation and feedback turnaround time. In a live exam setting where time is </w:t>
+      </w:r>
+      <w:r>
+        <w:t>limited and pressure is already high, these delays can directly affect a student's ability to test, debug, and finalize their submission before time runs out.</w:t>
       </w:r>
       <w:r>
         <w:br/>
@@ -108,7 +135,13 @@
     </w:p>
     <w:p>
       <w:r>
-        <w:t xml:space="preserve">Beyond performance limitations, most cloud-based programming assessment platforms also lack system-wide exam lockdown mechanisms. While they can evaluate code submissions, they cannot restrict students from switching applications, accessing unauthorized resources, copy-pasting solutions, or using AI-powered tools during an examination. This creates a major academic integrity gap, as students remain free to interact with the rest of their desktop </w:t>
+        <w:t>Beyond performance limitations, most cloud-based programming assessment platforms also lack syst</w:t>
+      </w:r>
+      <w:r>
+        <w:t>em-wide exam lockdown mechanisms. While they can evaluate code submissions, they cannot restrict students from switching applications, accessing unauthorized resources, copy-pasting solutions, or using AI-powered tools during an examination. This creates a</w:t>
+      </w:r>
+      <w:r>
+        <w:t xml:space="preserve"> major academic integrity gap, as students remain free to interact with the rest of their desktop </w:t>
       </w:r>
       <w:r>
         <w:lastRenderedPageBreak/>
@@ -125,7 +158,10 @@
       </w:r>
       <w:proofErr w:type="spellEnd"/>
       <w:r>
-        <w:t xml:space="preserve"> addresses both of these problems by combining system-wide desktop lockdown with local code compilation and automated assessment on each student's machine. By enforcing input restrictions and preventing access to unauthorized applications, </w:t>
+        <w:t xml:space="preserve"> addresses both of these problems by combining system-wide desktop lockdown with local code compilation and automat</w:t>
+      </w:r>
+      <w:r>
+        <w:t xml:space="preserve">ed assessment on each student's machine. By enforcing input restrictions and preventing access to unauthorized applications, </w:t>
       </w:r>
       <w:proofErr w:type="spellStart"/>
       <w:r>
@@ -133,7 +169,10 @@
       </w:r>
       <w:proofErr w:type="spellEnd"/>
       <w:r>
-        <w:t xml:space="preserve"> strengthens exam security and minimizes opportunities for cheating. At the same time, by eliminating dependency on server-side compilation for grading, </w:t>
+        <w:t xml:space="preserve"> strengthens exam security and minimizes opportunities for cheating. At the same time, by eliminating dependency on server-s</w:t>
+      </w:r>
+      <w:r>
+        <w:t xml:space="preserve">ide compilation for grading, </w:t>
       </w:r>
       <w:proofErr w:type="spellStart"/>
       <w:r>
@@ -141,7 +180,10 @@
       </w:r>
       <w:proofErr w:type="spellEnd"/>
       <w:r>
-        <w:t xml:space="preserve"> ensures that assessment speed remains consistent and unaffected by the number of students testing their code at the same time, even during peak examination periods. This dual approach to secure exam enforcement and local-first evaluation is the core design decision that distinguishes </w:t>
+        <w:t xml:space="preserve"> ensures that assessment speed remains consistent and unaffected by the number of students testing their code at the same time, even during peak examination periods. This dual approach to secure exam enforcement and loca</w:t>
+      </w:r>
+      <w:r>
+        <w:t xml:space="preserve">l-first evaluation is the core design decision that distinguishes </w:t>
       </w:r>
       <w:proofErr w:type="spellStart"/>
       <w:r>
@@ -233,7 +275,14 @@
           <w:sz w:val="24"/>
           <w:szCs w:val="24"/>
         </w:rPr>
-        <w:t>● Teachers and students in CHED-accredited Computer Science (CS), Information Technology (IT), and Information Systems (IS) programs using Windows-based computer laboratories</w:t>
+        <w:t>● Teachers and students in CHED-accredited Computer Science (CS), Information Technology (IT)</w:t>
+      </w:r>
+      <w:r>
+        <w:rPr>
+          <w:sz w:val="24"/>
+          <w:szCs w:val="24"/>
+        </w:rPr>
+        <w:t>, and Information Systems (IS) programs using Windows-based computer laboratories</w:t>
       </w:r>
     </w:p>
     <w:p>
@@ -263,7 +312,14 @@
           <w:sz w:val="24"/>
           <w:szCs w:val="24"/>
         </w:rPr>
-        <w:t>● Cloud-based deployment for exam management, authentication, synchronization, and monitoring, with local desktop installation required on student machines</w:t>
+        <w:t>● Cloud-based deployment for exam management, authentication, synchronization, and monitoring, with</w:t>
+      </w:r>
+      <w:r>
+        <w:rPr>
+          <w:sz w:val="24"/>
+          <w:szCs w:val="24"/>
+        </w:rPr>
+        <w:t xml:space="preserve"> local desktop installation required on student machines</w:t>
       </w:r>
     </w:p>
     <w:p>
@@ -308,7 +364,14 @@
           <w:sz w:val="24"/>
           <w:szCs w:val="24"/>
         </w:rPr>
-        <w:t>● Teacher and Student roles only, no institutional administrator layer</w:t>
+        <w:t>● Teacher and Student roles only, no institutional administr</w:t>
+      </w:r>
+      <w:r>
+        <w:rPr>
+          <w:sz w:val="24"/>
+          <w:szCs w:val="24"/>
+        </w:rPr>
+        <w:t>ator layer</w:t>
       </w:r>
     </w:p>
     <w:p>
@@ -338,7 +401,14 @@
           <w:sz w:val="24"/>
           <w:szCs w:val="24"/>
         </w:rPr>
-        <w:t>● Local-first code compilation and execution for coding assessments, while exam data and results are synchronized through the cloud</w:t>
+        <w:t>● Local-first code compilation and execution for coding assessments, while exam data and results are synchronized t</w:t>
+      </w:r>
+      <w:r>
+        <w:rPr>
+          <w:sz w:val="24"/>
+          <w:szCs w:val="24"/>
+        </w:rPr>
+        <w:t>hrough the cloud</w:t>
       </w:r>
       <w:r>
         <w:rPr>
@@ -406,7 +476,14 @@
           <w:sz w:val="24"/>
           <w:szCs w:val="24"/>
         </w:rPr>
-        <w:t>● Internet connection is required for authentication, exam synchronization, and teacher monitoring; fully offline examinations are outside the scope of the system</w:t>
+        <w:t xml:space="preserve">● Internet connection is required for authentication, exam synchronization, and teacher monitoring; fully offline examinations are </w:t>
+      </w:r>
+      <w:r>
+        <w:rPr>
+          <w:sz w:val="24"/>
+          <w:szCs w:val="24"/>
+        </w:rPr>
+        <w:t>outside the scope of the system</w:t>
       </w:r>
     </w:p>
     <w:p>
@@ -528,7 +605,14 @@
           <w:sz w:val="24"/>
           <w:szCs w:val="24"/>
         </w:rPr>
-        <w:t>● The system is designed for controlled laboratory environments and is not optimized for personal home-use devices or remote take-home examinations</w:t>
+        <w:t>● The system is desi</w:t>
+      </w:r>
+      <w:r>
+        <w:rPr>
+          <w:sz w:val="24"/>
+          <w:szCs w:val="24"/>
+        </w:rPr>
+        <w:t>gned for controlled laboratory environments and is not optimized for personal home-use devices or remote take-home examinations</w:t>
       </w:r>
     </w:p>
     <w:p>
@@ -826,7 +910,14 @@
                 <w:sz w:val="24"/>
                 <w:szCs w:val="24"/>
               </w:rPr>
-              <w:t>React (Electron Renderer)</w:t>
+              <w:t xml:space="preserve">React (Electron </w:t>
+            </w:r>
+            <w:r>
+              <w:rPr>
+                <w:sz w:val="24"/>
+                <w:szCs w:val="24"/>
+              </w:rPr>
+              <w:t>Renderer)</w:t>
             </w:r>
           </w:p>
         </w:tc>
@@ -1180,7 +1271,14 @@
                 <w:sz w:val="24"/>
                 <w:szCs w:val="24"/>
               </w:rPr>
-              <w:t>SQLite (better-sqlite3)</w:t>
+              <w:t xml:space="preserve">SQLite </w:t>
+            </w:r>
+            <w:r>
+              <w:rPr>
+                <w:sz w:val="24"/>
+                <w:szCs w:val="24"/>
+              </w:rPr>
+              <w:t>(better-sqlite3)</w:t>
             </w:r>
           </w:p>
         </w:tc>
@@ -1416,7 +1514,22 @@
       </w:pPr>
       <w:bookmarkStart w:id="5" w:name="_96mp58auhhao" w:colFirst="0" w:colLast="0"/>
       <w:bookmarkEnd w:id="5"/>
-      <w:r>
+    </w:p>
+    <w:p/>
+    <w:p/>
+    <w:p>
+      <w:r>
+        <w:br w:type="page"/>
+      </w:r>
+      <w:bookmarkStart w:id="6" w:name="_GoBack"/>
+      <w:bookmarkEnd w:id="6"/>
+    </w:p>
+    <w:p>
+      <w:pPr>
+        <w:pStyle w:val="Heading3"/>
+        <w:keepNext w:val="0"/>
+        <w:keepLines w:val="0"/>
+        <w:spacing w:before="0" w:after="0"/>
         <w:rPr>
           <w:b/>
           <w:bCs/>
@@ -1424,6 +1537,16 @@
           <w:sz w:val="24"/>
           <w:szCs w:val="24"/>
         </w:rPr>
+      </w:pPr>
+      <w:r>
+        <w:rPr>
+          <w:b/>
+          <w:bCs/>
+          <w:color w:val="000000"/>
+          <w:sz w:val="24"/>
+          <w:szCs w:val="24"/>
+        </w:rPr>
+        <w:lastRenderedPageBreak/>
         <w:t>Web Application (Teacher Portal / Cloud Management)</w:t>
       </w:r>
     </w:p>
@@ -1552,7 +1675,6 @@
                 <w:sz w:val="24"/>
                 <w:szCs w:val="24"/>
               </w:rPr>
-              <w:lastRenderedPageBreak/>
               <w:t>Frontend Framework</w:t>
             </w:r>
           </w:p>
@@ -2080,8 +2202,8 @@
           <w:szCs w:val="24"/>
         </w:rPr>
       </w:pPr>
-      <w:bookmarkStart w:id="6" w:name="_p7wks9kvox3c" w:colFirst="0" w:colLast="0"/>
-      <w:bookmarkEnd w:id="6"/>
+      <w:bookmarkStart w:id="7" w:name="_p7wks9kvox3c" w:colFirst="0" w:colLast="0"/>
+      <w:bookmarkEnd w:id="7"/>
       <w:r>
         <w:rPr>
           <w:b/>
@@ -2601,7 +2723,14 @@
                 <w:sz w:val="24"/>
                 <w:szCs w:val="24"/>
               </w:rPr>
-              <w:t>Windows Core Audio API</w:t>
+              <w:t xml:space="preserve">Windows Core </w:t>
+            </w:r>
+            <w:r>
+              <w:rPr>
+                <w:sz w:val="24"/>
+                <w:szCs w:val="24"/>
+              </w:rPr>
+              <w:t>Audio API</w:t>
             </w:r>
           </w:p>
         </w:tc>
@@ -2780,7 +2909,7 @@
 </file>
 
 <file path=word/styles.xml><?xml version="1.0" encoding="utf-8"?>
-<w:styles xmlns:mc="http://schemas.openxmlformats.org/markup-compatibility/2006" xmlns:r="http://schemas.openxmlformats.org/officeDocument/2006/relationships" xmlns:w="http://schemas.openxmlformats.org/wordprocessingml/2006/main" xmlns:w14="http://schemas.microsoft.com/office/word/2010/wordml" xmlns:w15="http://schemas.microsoft.com/office/word/2012/wordml" xmlns:w16cex="http://schemas.microsoft.com/office/word/2018/wordml/cex" xmlns:w16cid="http://schemas.microsoft.com/office/word/2016/wordml/cid" xmlns:w16="http://schemas.microsoft.com/office/word/2018/wordml" xmlns:w16du="http://schemas.microsoft.com/office/word/2023/wordml/word16du" xmlns:w16sdtdh="http://schemas.microsoft.com/office/word/2020/wordml/sdtdatahash" xmlns:w16sdtfl="http://schemas.microsoft.com/office/word/2024/wordml/sdtformatlock" xmlns:w16se="http://schemas.microsoft.com/office/word/2015/wordml/symex" mc:Ignorable="w14 w15 w16se w16cid w16 w16cex w16sdtdh w16sdtfl w16du">
+<w:styles xmlns:mc="http://schemas.openxmlformats.org/markup-compatibility/2006" xmlns:r="http://schemas.openxmlformats.org/officeDocument/2006/relationships" xmlns:w="http://schemas.openxmlformats.org/wordprocessingml/2006/main" xmlns:w14="http://schemas.microsoft.com/office/word/2010/wordml" xmlns:w15="http://schemas.microsoft.com/office/word/2012/wordml" xmlns:w16cid="http://schemas.microsoft.com/office/word/2016/wordml/cid" xmlns:w16se="http://schemas.microsoft.com/office/word/2015/wordml/symex" mc:Ignorable="w14 w15 w16se w16cid">
   <w:docDefaults>
     <w:rPrDefault>
       <w:rPr>
@@ -2796,7 +2925,7 @@
       </w:pPr>
     </w:pPrDefault>
   </w:docDefaults>
-  <w:latentStyles w:defLockedState="0" w:defUIPriority="99" w:defSemiHidden="0" w:defUnhideWhenUsed="0" w:defQFormat="0" w:count="376">
+  <w:latentStyles w:defLockedState="0" w:defUIPriority="99" w:defSemiHidden="0" w:defUnhideWhenUsed="0" w:defQFormat="0" w:count="375">
     <w:lsdException w:name="Normal" w:uiPriority="0" w:qFormat="1"/>
     <w:lsdException w:name="heading 1" w:uiPriority="9" w:qFormat="1"/>
     <w:lsdException w:name="heading 2" w:semiHidden="1" w:uiPriority="9" w:unhideWhenUsed="1" w:qFormat="1"/>
@@ -3172,7 +3301,6 @@
     <w:lsdException w:name="Smart Hyperlink" w:semiHidden="1" w:unhideWhenUsed="1"/>
     <w:lsdException w:name="Hashtag" w:semiHidden="1" w:unhideWhenUsed="1"/>
     <w:lsdException w:name="Unresolved Mention" w:semiHidden="1" w:unhideWhenUsed="1"/>
-    <w:lsdException w:name="Smart Link" w:semiHidden="1" w:unhideWhenUsed="1"/>
   </w:latentStyles>
   <w:style w:type="paragraph" w:default="1" w:styleId="Normal">
     <w:name w:val="Normal"/>

</xml_diff>